<commit_message>
Word versions of all 22 documents; converter fixes
Co-Authored-By: Claude Opus 5.5 <noreply@anthropic.com>
Claude-Session: https://claude.ai/code/session_015WVgZKTbSWpZTjn6aZsqC9
</commit_message>
<xml_diff>
--- a/documents/ln/molakhas_ln_3as.docx
+++ b/documents/ln/molakhas_ln_3as.docx
@@ -12168,7 +12168,7 @@
                 <w:bCs/>
                 <w:rtl/>
               </w:rPr>
-              <w:t xml:space="preserve">I.</w:t>
+              <w:t xml:space="preserve">‎I.</w:t>
             </w:r>
             <w:r>
               <w:rPr>
@@ -12488,7 +12488,7 @@
                 <w:bCs/>
                 <w:rtl/>
               </w:rPr>
-              <w:t xml:space="preserve">II.</w:t>
+              <w:t xml:space="preserve">‎II.</w:t>
             </w:r>
             <w:r>
               <w:rPr>
@@ -13233,7 +13233,7 @@
                 <w:bCs/>
                 <w:rtl/>
               </w:rPr>
-              <w:t xml:space="preserve">I.</w:t>
+              <w:t xml:space="preserve">‎I.</w:t>
             </w:r>
           </w:p>
           <w:p>
@@ -13599,7 +13599,7 @@
                 <w:bCs/>
                 <w:rtl/>
               </w:rPr>
-              <w:t xml:space="preserve">II.</w:t>
+              <w:t xml:space="preserve">‎II.</w:t>
             </w:r>
           </w:p>
           <w:p>

</xml_diff>